<commit_message>
Manual: listas solo Excel/CSV/PDF
</commit_message>
<xml_diff>
--- a/descargas/Manual_FIAS.docx
+++ b/descargas/Manual_FIAS.docx
@@ -7323,7 +7323,17 @@
         <w:t xml:space="preserve">Subir lista de precios</w:t>
       </w:r>
       <w:r>
-        <w:t xml:space="preserve">. Sirve para actualizar de una vez los costos de todos los productos de un proveedor a partir de su lista (Excel, CSV, PDF o foto).</w:t>
+        <w:t xml:space="preserve">. Sirve para actualizar de una vez los costos de todos los productos de un proveedor a partir de su lista en </w:t>
+      </w:r>
+      <w:r>
+        <w:rPr>
+          <w:b/>
+          <w:bCs/>
+        </w:rPr>
+        <w:t xml:space="preserve">Excel, CSV o PDF</w:t>
+      </w:r>
+      <w:r>
+        <w:t xml:space="preserve">. Las listas en foto no se aceptan: pedile al proveedor el archivo.</w:t>
       </w:r>
     </w:p>
     <w:p>
@@ -7490,7 +7500,7 @@
         <w:spacing w:after="80"/>
       </w:pPr>
       <w:r>
-        <w:t xml:space="preserve">Arrastrá el archivo o hacé clic para buscarlo. Formatos: Excel, CSV, PDF o foto, hasta 20 MB.</w:t>
+        <w:t xml:space="preserve">Arrastrá el archivo o hacé clic para buscarlo. Formatos: Excel, CSV o PDF, hasta 20 MB (fotos no).</w:t>
       </w:r>
     </w:p>
     <w:p>
@@ -14595,7 +14605,7 @@
         <w:t xml:space="preserve">Dueño</w:t>
       </w:r>
       <w:r>
-        <w:t xml:space="preserve"> (número vinculado): consultas (ventas del día, stock, fiados, caja, informes), acciones (vender, fiar, registrar entregas y gastos, crear productos y clientes), cargar boletas y listas por foto, presupuestos en PDF, backups, agenda y recordatorios.</w:t>
+        <w:t xml:space="preserve"> (número vinculado): consultas (ventas del día, stock, fiados, caja, informes), acciones (vender, fiar, registrar entregas y gastos, crear productos y clientes), cargar boletas por foto y listas en Excel o PDF, presupuestos en PDF, backups, agenda y recordatorios.</w:t>
       </w:r>
     </w:p>
     <w:p>
@@ -14901,12 +14911,12 @@
         <w:pStyle w:val="Heading2"/>
       </w:pPr>
       <w:r>
-        <w:t xml:space="preserve">11.5 Boletas y listas por foto</w:t>
-      </w:r>
-    </w:p>
-    <w:p>
-      <w:r>
-        <w:t xml:space="preserve">Avisale primero qué le vas a mandar («te paso la boleta de Ferretera», «va la lista de Lekons, usá la columna con IVA») y después mandá la foto o el archivo. Te muestra el resumen y con tu «sí» la carga como </w:t>
+        <w:t xml:space="preserve">11.5 Boletas y listas de precios</w:t>
+      </w:r>
+    </w:p>
+    <w:p>
+      <w:r>
+        <w:t xml:space="preserve">Avisale primero qué le vas a mandar («te paso la boleta de Ferretera», «va la lista de Lekons, usá la columna con IVA») y después mandá la foto de la boleta o el archivo de la lista (Excel, CSV o PDF; las listas en foto no se aceptan). Te muestra el resumen y con tu «sí» la carga como </w:t>
       </w:r>
       <w:r>
         <w:rPr>

</xml_diff>